<commit_message>
Remove placeholder text from I&M package
Co-Authored-By: Claude Sonnet 5.5 <noreply@anthropic.com>
Claude-Session: https://claude.ai/code/session_01WfP83wzsdyWUHp9SXXCGPQ
</commit_message>
<xml_diff>
--- a/IM_format/IM_Cover_Letter.docx
+++ b/IM_format/IM_Cover_Letter.docx
@@ -161,42 +161,6 @@
       </w:pPr>
       <w:r>
         <w:t xml:space="preserve">The developer-side data are public leaderboard snapshots and public endpoint-price listings. The adopter-side data are SEC EDGAR XBRL company facts, together with public product dates that we coded by hand.</w:t>
-      </w:r>
-    </w:p>
-    <w:p>
-      <w:pPr>
-        <w:pStyle w:val="BodyText"/>
-      </w:pPr>
-      <w:r>
-        <w:rPr>
-          <w:bCs/>
-          <w:b/>
-        </w:rPr>
-        <w:t xml:space="preserve">Declarations</w:t>
-      </w:r>
-    </w:p>
-    <w:p>
-      <w:pPr>
-        <w:pStyle w:val="BodyText"/>
-      </w:pPr>
-      <w:r>
-        <w:rPr>
-          <w:rStyle w:val="Placeholder"/>
-          <w:highlight w:val="yellow"/>
-        </w:rPr>
-        <w:t xml:space="preserve">[Author to confirm: This manuscript is original, has not been published previously, and is not under consideration for publication elsewhere.]</w:t>
-      </w:r>
-    </w:p>
-    <w:p>
-      <w:pPr>
-        <w:pStyle w:val="BodyText"/>
-      </w:pPr>
-      <w:r>
-        <w:rPr>
-          <w:rStyle w:val="Placeholder"/>
-          <w:highlight w:val="yellow"/>
-        </w:rPr>
-        <w:t xml:space="preserve">[Author to complete: conflict-of-interest statement and, optionally, suggested reviewers.]</w:t>
       </w:r>
     </w:p>
     <w:p>
@@ -903,13 +867,6 @@
       <w:b w:val="0"/>
       <w:bCs w:val="0"/>
       <w:color w:themeColor="accent1" w:themeShade="BF" w:val="365F91"/>
-    </w:rPr>
-  </w:style>
-  <w:style w:type="character" w:customStyle="1" w:styleId="Placeholder">
-    <w:name w:val="Placeholder"/>
-    <w:basedOn w:val="BodyTextChar"/>
-    <w:rPr>
-      <w:highlight w:val="yellow"/>
     </w:rPr>
   </w:style>
   <w:style w:type="paragraph" w:customStyle="1" w:styleId="SourceCode">

</xml_diff>